<commit_message>
Clarify cloud environment settings steps in Bitrix24 memo
Co-Authored-By: Claude Opus 5.5 <noreply@anthropic.com>
Claude-Session: https://claude.ai/code/session_01QDqzUmjJPcgJuc8oYqmQ3L
</commit_message>
<xml_diff>
--- a/bitrix24-claude/pamyatka-claude-bitrix24.docx
+++ b/bitrix24-claude/pamyatka-claude-bitrix24.docx
@@ -437,7 +437,20 @@
         <w:t xml:space="preserve"> </w:t>
       </w:r>
       <w:r>
-        <w:t xml:space="preserve">claude.ai/code → меню облачного окружения в заголовке сессии →</w:t>
+        <w:t xml:space="preserve">claude.ai/code → над полем ввода кнопка с облаком и названием окружения (например,</w:t>
+      </w:r>
+      <w:r>
+        <w:t xml:space="preserve"> </w:t>
+      </w:r>
+      <w:r>
+        <w:rPr>
+          <w:iCs/>
+          <w:i/>
+        </w:rPr>
+        <w:t xml:space="preserve">Default</w:t>
+      </w:r>
+      <w:r>
+        <w:t xml:space="preserve">) →</w:t>
       </w:r>
       <w:r>
         <w:t xml:space="preserve"> </w:t>
@@ -447,16 +460,13 @@
           <w:bCs/>
           <w:b/>
         </w:rPr>
-        <w:t xml:space="preserve">Edit</w:t>
-      </w:r>
-      <w:r>
-        <w:t xml:space="preserve">:</w:t>
-      </w:r>
-      <w:r>
-        <w:t xml:space="preserve"> </w:t>
-      </w:r>
-      <w:r>
-        <w:t xml:space="preserve">-</w:t>
+        <w:t xml:space="preserve">Cloud</w:t>
+      </w:r>
+      <w:r>
+        <w:t xml:space="preserve"> </w:t>
+      </w:r>
+      <w:r>
+        <w:t xml:space="preserve">→ навести на окружение → значок шестерёнки справа → окно</w:t>
       </w:r>
       <w:r>
         <w:t xml:space="preserve"> </w:t>
@@ -466,13 +476,32 @@
           <w:bCs/>
           <w:b/>
         </w:rPr>
+        <w:t xml:space="preserve">Edit environment</w:t>
+      </w:r>
+      <w:r>
+        <w:t xml:space="preserve">:</w:t>
+      </w:r>
+      <w:r>
+        <w:t xml:space="preserve"> </w:t>
+      </w:r>
+      <w:r>
+        <w:t xml:space="preserve">-</w:t>
+      </w:r>
+      <w:r>
+        <w:t xml:space="preserve"> </w:t>
+      </w:r>
+      <w:r>
+        <w:rPr>
+          <w:bCs/>
+          <w:b/>
+        </w:rPr>
         <w:t xml:space="preserve">Network access</w:t>
       </w:r>
       <w:r>
         <w:t xml:space="preserve"> </w:t>
       </w:r>
       <w:r>
-        <w:t xml:space="preserve">→ уровень</w:t>
+        <w:t xml:space="preserve">→</w:t>
       </w:r>
       <w:r>
         <w:t xml:space="preserve"> </w:t>
@@ -482,13 +511,41 @@
           <w:iCs/>
           <w:i/>
         </w:rPr>
-        <w:t xml:space="preserve">Limited</w:t>
-      </w:r>
-      <w:r>
-        <w:t xml:space="preserve"> </w:t>
-      </w:r>
-      <w:r>
-        <w:t xml:space="preserve">(или</w:t>
+        <w:t xml:space="preserve">Custom</w:t>
+      </w:r>
+      <w:r>
+        <w:t xml:space="preserve"> </w:t>
+      </w:r>
+      <w:r>
+        <w:t xml:space="preserve">→ в поле</w:t>
+      </w:r>
+      <w:r>
+        <w:t xml:space="preserve"> </w:t>
+      </w:r>
+      <w:r>
+        <w:rPr>
+          <w:bCs/>
+          <w:b/>
+        </w:rPr>
+        <w:t xml:space="preserve">Allowed domains</w:t>
+      </w:r>
+      <w:r>
+        <w:t xml:space="preserve"> </w:t>
+      </w:r>
+      <w:r>
+        <w:t xml:space="preserve">написать</w:t>
+      </w:r>
+      <w:r>
+        <w:t xml:space="preserve"> </w:t>
+      </w:r>
+      <w:r>
+        <w:rPr>
+          <w:rStyle w:val="VerbatimChar"/>
+        </w:rPr>
+        <w:t xml:space="preserve">&lt;портал&gt;.bitrix24.ru</w:t>
+      </w:r>
+      <w:r>
+        <w:t xml:space="preserve">; отметить</w:t>
       </w:r>
       <w:r>
         <w:t xml:space="preserve"> </w:t>
@@ -498,10 +555,78 @@
           <w:iCs/>
           <w:i/>
         </w:rPr>
-        <w:t xml:space="preserve">Custom</w:t>
-      </w:r>
-      <w:r>
-        <w:t xml:space="preserve">) →</w:t>
+        <w:t xml:space="preserve">Also include default list of common package managers</w:t>
+      </w:r>
+      <w:r>
+        <w:t xml:space="preserve"> </w:t>
+      </w:r>
+      <w:r>
+        <w:t xml:space="preserve">→ сохранить. Действует и в уже открытой сессии примерно через минуту.</w:t>
+      </w:r>
+      <w:r>
+        <w:t xml:space="preserve"> </w:t>
+      </w:r>
+      <w:r>
+        <w:t xml:space="preserve">- Адрес вебхука сохранить в разделе</w:t>
+      </w:r>
+      <w:r>
+        <w:t xml:space="preserve"> </w:t>
+      </w:r>
+      <w:r>
+        <w:rPr>
+          <w:iCs/>
+          <w:i/>
+        </w:rPr>
+        <w:t xml:space="preserve">Network secrets</w:t>
+      </w:r>
+      <w:r>
+        <w:t xml:space="preserve"> </w:t>
+      </w:r>
+      <w:r>
+        <w:t xml:space="preserve">(есть только на тарифах Pro/Max) или в поле</w:t>
+      </w:r>
+      <w:r>
+        <w:t xml:space="preserve"> </w:t>
+      </w:r>
+      <w:r>
+        <w:rPr>
+          <w:iCs/>
+          <w:i/>
+        </w:rPr>
+        <w:t xml:space="preserve">Environment variables</w:t>
+      </w:r>
+      <w:r>
+        <w:t xml:space="preserve"> </w:t>
+      </w:r>
+      <w:r>
+        <w:t xml:space="preserve">строкой</w:t>
+      </w:r>
+      <w:r>
+        <w:t xml:space="preserve"> </w:t>
+      </w:r>
+      <w:r>
+        <w:rPr>
+          <w:rStyle w:val="VerbatimChar"/>
+        </w:rPr>
+        <w:t xml:space="preserve">B24_WEBHOOK_URL=&lt;адрес вебхука&gt;</w:t>
+      </w:r>
+      <w:r>
+        <w:t xml:space="preserve"> </w:t>
+      </w:r>
+      <w:r>
+        <w:t xml:space="preserve">(адрес заканчивается на</w:t>
+      </w:r>
+      <w:r>
+        <w:t xml:space="preserve"> </w:t>
+      </w:r>
+      <w:r>
+        <w:rPr>
+          <w:rStyle w:val="VerbatimChar"/>
+        </w:rPr>
+        <w:t xml:space="preserve">/</w:t>
+      </w:r>
+      <w:r>
+        <w:t xml:space="preserve">). Переменная видна всем, кто пользуется окружением, поэтому окружение должно быть личным. Переменную сессия подхватывает при</w:t>
       </w:r>
       <w:r>
         <w:t xml:space="preserve"> </w:t>
@@ -511,25 +636,19 @@
           <w:bCs/>
           <w:b/>
         </w:rPr>
-        <w:t xml:space="preserve">Allowed domains</w:t>
-      </w:r>
-      <w:r>
-        <w:t xml:space="preserve"> </w:t>
-      </w:r>
-      <w:r>
-        <w:t xml:space="preserve">→ добавить</w:t>
-      </w:r>
-      <w:r>
-        <w:t xml:space="preserve"> </w:t>
-      </w:r>
-      <w:r>
-        <w:rPr>
-          <w:rStyle w:val="VerbatimChar"/>
-        </w:rPr>
-        <w:t xml:space="preserve">&lt;портал&gt;.bitrix24.ru</w:t>
-      </w:r>
-      <w:r>
-        <w:t xml:space="preserve">; галочку</w:t>
+        <w:t xml:space="preserve">новом</w:t>
+      </w:r>
+      <w:r>
+        <w:t xml:space="preserve"> </w:t>
+      </w:r>
+      <w:r>
+        <w:t xml:space="preserve">запуске.</w:t>
+      </w:r>
+      <w:r>
+        <w:t xml:space="preserve"> </w:t>
+      </w:r>
+      <w:r>
+        <w:t xml:space="preserve">- Если окружение в разделе</w:t>
       </w:r>
       <w:r>
         <w:t xml:space="preserve"> </w:t>
@@ -539,78 +658,13 @@
           <w:iCs/>
           <w:i/>
         </w:rPr>
-        <w:t xml:space="preserve">Allow package managers</w:t>
-      </w:r>
-      <w:r>
-        <w:t xml:space="preserve"> </w:t>
-      </w:r>
-      <w:r>
-        <w:t xml:space="preserve">оставить.</w:t>
-      </w:r>
-      <w:r>
-        <w:t xml:space="preserve"> </w:t>
-      </w:r>
-      <w:r>
-        <w:t xml:space="preserve">- Адрес вебхука сохранить как секрет окружения (раздел</w:t>
-      </w:r>
-      <w:r>
-        <w:t xml:space="preserve"> </w:t>
-      </w:r>
-      <w:r>
-        <w:rPr>
-          <w:iCs/>
-          <w:i/>
-        </w:rPr>
-        <w:t xml:space="preserve">Network secrets</w:t>
-      </w:r>
-      <w:r>
-        <w:t xml:space="preserve">, если его нет — переменная окружения) с именем</w:t>
-      </w:r>
-      <w:r>
-        <w:t xml:space="preserve"> </w:t>
-      </w:r>
-      <w:r>
-        <w:rPr>
-          <w:rStyle w:val="VerbatimChar"/>
-        </w:rPr>
-        <w:t xml:space="preserve">B24_WEBHOOK_URL</w:t>
-      </w:r>
-      <w:r>
-        <w:t xml:space="preserve">. Адрес заканчивается на</w:t>
-      </w:r>
-      <w:r>
-        <w:t xml:space="preserve"> </w:t>
-      </w:r>
-      <w:r>
-        <w:rPr>
-          <w:rStyle w:val="VerbatimChar"/>
-        </w:rPr>
-        <w:t xml:space="preserve">/</w:t>
-      </w:r>
-      <w:r>
-        <w:t xml:space="preserve">.</w:t>
-      </w:r>
-      <w:r>
-        <w:t xml:space="preserve"> </w:t>
-      </w:r>
-      <w:r>
-        <w:t xml:space="preserve">- После изменения открыть</w:t>
-      </w:r>
-      <w:r>
-        <w:t xml:space="preserve"> </w:t>
-      </w:r>
-      <w:r>
-        <w:rPr>
-          <w:bCs/>
-          <w:b/>
-        </w:rPr>
-        <w:t xml:space="preserve">новую</w:t>
-      </w:r>
-      <w:r>
-        <w:t xml:space="preserve"> </w:t>
-      </w:r>
-      <w:r>
-        <w:t xml:space="preserve">сессию — настройки подхватываются при старте.</w:t>
+        <w:t xml:space="preserve">Organization</w:t>
+      </w:r>
+      <w:r>
+        <w:t xml:space="preserve"> </w:t>
+      </w:r>
+      <w:r>
+        <w:t xml:space="preserve">— оно общее и открывается только для чтения: менять его должен владелец, писать ГД.</w:t>
       </w:r>
     </w:p>
     <w:bookmarkEnd w:id="21"/>
@@ -930,7 +984,7 @@
               <w:rPr>
                 <w:sz w:val="18"/>
               </w:rPr>
-              <w:t xml:space="preserve">п. 2.2: добавить домен в Allowed domains, открыть новую сессию</w:t>
+              <w:t xml:space="preserve">п. 2.2: добавить домен в Allowed domains, подождать минуту</w:t>
             </w:r>
           </w:p>
         </w:tc>

</xml_diff>

<commit_message>
Note where cloud environment settings can be edited
Co-Authored-By: Claude Opus 5.5 <noreply@anthropic.com>
Claude-Session: https://claude.ai/code/session_01QDqzUmjJPcgJuc8oYqmQ3L
</commit_message>
<xml_diff>
--- a/bitrix24-claude/pamyatka-claude-bitrix24.docx
+++ b/bitrix24-claude/pamyatka-claude-bitrix24.docx
@@ -437,7 +437,23 @@
         <w:t xml:space="preserve"> </w:t>
       </w:r>
       <w:r>
-        <w:t xml:space="preserve">claude.ai/code → над полем ввода кнопка с облаком и названием окружения (например,</w:t>
+        <w:t xml:space="preserve">claude.ai/code,</w:t>
+      </w:r>
+      <w:r>
+        <w:t xml:space="preserve"> </w:t>
+      </w:r>
+      <w:r>
+        <w:rPr>
+          <w:bCs/>
+          <w:b/>
+        </w:rPr>
+        <w:t xml:space="preserve">стартовый экран</w:t>
+      </w:r>
+      <w:r>
+        <w:t xml:space="preserve"> </w:t>
+      </w:r>
+      <w:r>
+        <w:t xml:space="preserve">(где начинают новую сессию) → над полем ввода кнопка с облаком и названием окружения (например,</w:t>
       </w:r>
       <w:r>
         <w:t xml:space="preserve"> </w:t>
@@ -460,26 +476,23 @@
           <w:bCs/>
           <w:b/>
         </w:rPr>
+        <w:t xml:space="preserve">Облако</w:t>
+      </w:r>
+      <w:r>
+        <w:t xml:space="preserve"> </w:t>
+      </w:r>
+      <w:r>
+        <w:t xml:space="preserve">(</w:t>
+      </w:r>
+      <w:r>
+        <w:rPr>
+          <w:iCs/>
+          <w:i/>
+        </w:rPr>
         <w:t xml:space="preserve">Cloud</w:t>
       </w:r>
       <w:r>
-        <w:t xml:space="preserve"> </w:t>
-      </w:r>
-      <w:r>
-        <w:t xml:space="preserve">→ навести на окружение → значок шестерёнки справа → окно</w:t>
-      </w:r>
-      <w:r>
-        <w:t xml:space="preserve"> </w:t>
-      </w:r>
-      <w:r>
-        <w:rPr>
-          <w:bCs/>
-          <w:b/>
-        </w:rPr>
-        <w:t xml:space="preserve">Edit environment</w:t>
-      </w:r>
-      <w:r>
-        <w:t xml:space="preserve">:</w:t>
+        <w:t xml:space="preserve">) → навести на окружение → значок шестерёнки справа → окно редактирования окружения. Значок облака в заголовке уже открытой сессии только показывает окружение, изменить там нельзя (✅ проверено):</w:t>
       </w:r>
       <w:r>
         <w:t xml:space="preserve"> </w:t>

</xml_diff>

<commit_message>
Update Bitrix24 memo with verified webhook connection results
Connection, rights check, own-task reading and the three example prompts
verified; task chat comments confirmed unavailable without im scope.

Co-Authored-By: Claude Opus 5.5 <noreply@anthropic.com>
Claude-Session: https://claude.ai/code/session_01QDqzUmjJPcgJuc8oYqmQ3L
</commit_message>
<xml_diff>
--- a/bitrix24-claude/pamyatka-claude-bitrix24.docx
+++ b/bitrix24-claude/pamyatka-claude-bitrix24.docx
@@ -373,34 +373,7 @@
         <w:t xml:space="preserve"> </w:t>
       </w:r>
       <w:r>
-        <w:t xml:space="preserve">Битрикс24 → «Разработчикам» → «Другое» → «Входящий вебхук» (в разных версиях интерфейса путь может немного отличаться).</w:t>
-      </w:r>
-      <w:r>
-        <w:t xml:space="preserve"> </w:t>
-      </w:r>
-      <w:r>
-        <w:t xml:space="preserve">Права: только то, что нужно для работы с задачами, — «Задачи (task)» и «Пользователи (user)». Лишние права не добавлять. Сохранить.</w:t>
-      </w:r>
-      <w:r>
-        <w:t xml:space="preserve"> </w:t>
-      </w:r>
-      <w:r>
-        <w:t xml:space="preserve">Адрес вида</w:t>
-      </w:r>
-      <w:r>
-        <w:t xml:space="preserve"> </w:t>
-      </w:r>
-      <w:r>
-        <w:rPr>
-          <w:rStyle w:val="VerbatimChar"/>
-        </w:rPr>
-        <w:t xml:space="preserve">https://&lt;портал&gt;.bitrix24.ru/rest/&lt;ID пользователя&gt;/&lt;секретный ключ&gt;/</w:t>
-      </w:r>
-      <w:r>
-        <w:t xml:space="preserve"> </w:t>
-      </w:r>
-      <w:r>
-        <w:t xml:space="preserve">—</w:t>
+        <w:t xml:space="preserve">Битрикс24 → «Разработчикам» → «Другое» → «Входящий вебхук». В блоке</w:t>
       </w:r>
       <w:r>
         <w:t xml:space="preserve"> </w:t>
@@ -410,6 +383,91 @@
           <w:bCs/>
           <w:b/>
         </w:rPr>
+        <w:t xml:space="preserve">«Настройка прав»</w:t>
+      </w:r>
+      <w:r>
+        <w:t xml:space="preserve"> </w:t>
+      </w:r>
+      <w:r>
+        <w:t xml:space="preserve">выбрать только</w:t>
+      </w:r>
+      <w:r>
+        <w:t xml:space="preserve"> </w:t>
+      </w:r>
+      <w:r>
+        <w:rPr>
+          <w:bCs/>
+          <w:b/>
+        </w:rPr>
+        <w:t xml:space="preserve">«Задачи (task)»</w:t>
+      </w:r>
+      <w:r>
+        <w:t xml:space="preserve"> </w:t>
+      </w:r>
+      <w:r>
+        <w:t xml:space="preserve">и</w:t>
+      </w:r>
+      <w:r>
+        <w:t xml:space="preserve"> </w:t>
+      </w:r>
+      <w:r>
+        <w:rPr>
+          <w:bCs/>
+          <w:b/>
+        </w:rPr>
+        <w:t xml:space="preserve">«Пользователи (user)»</w:t>
+      </w:r>
+      <w:r>
+        <w:t xml:space="preserve"> </w:t>
+      </w:r>
+      <w:r>
+        <w:t xml:space="preserve">и обязательно нажать</w:t>
+      </w:r>
+      <w:r>
+        <w:t xml:space="preserve"> </w:t>
+      </w:r>
+      <w:r>
+        <w:rPr>
+          <w:bCs/>
+          <w:b/>
+        </w:rPr>
+        <w:t xml:space="preserve">«Создать»</w:t>
+      </w:r>
+      <w:r>
+        <w:t xml:space="preserve"> </w:t>
+      </w:r>
+      <w:r>
+        <w:t xml:space="preserve">внизу окна (при изменении — «Сохранить»). Пока кнопка не нажата, вебхук работает без прав.</w:t>
+      </w:r>
+      <w:r>
+        <w:t xml:space="preserve"> </w:t>
+      </w:r>
+      <w:r>
+        <w:t xml:space="preserve">Адрес вида</w:t>
+      </w:r>
+      <w:r>
+        <w:t xml:space="preserve"> </w:t>
+      </w:r>
+      <w:r>
+        <w:rPr>
+          <w:rStyle w:val="VerbatimChar"/>
+        </w:rPr>
+        <w:t xml:space="preserve">https://&lt;портал&gt;.bitrix24.ru/rest/&lt;ID пользователя&gt;/&lt;секретный ключ&gt;/</w:t>
+      </w:r>
+      <w:r>
+        <w:t xml:space="preserve"> </w:t>
+      </w:r>
+      <w:r>
+        <w:t xml:space="preserve">—</w:t>
+      </w:r>
+      <w:r>
+        <w:t xml:space="preserve"> </w:t>
+      </w:r>
+      <w:r>
+        <w:rPr>
+          <w:bCs/>
+          <w:b/>
+        </w:rPr>
         <w:t xml:space="preserve">секрет, равный паролю</w:t>
       </w:r>
       <w:r>
@@ -431,12 +489,6 @@
         <w:t xml:space="preserve"> </w:t>
       </w:r>
       <w:r>
-        <w:t xml:space="preserve">⚠️</w:t>
-      </w:r>
-      <w:r>
-        <w:t xml:space="preserve"> </w:t>
-      </w:r>
-      <w:r>
         <w:t xml:space="preserve">claude.ai/code,</w:t>
       </w:r>
       <w:r>
@@ -482,23 +534,45 @@
         <w:t xml:space="preserve"> </w:t>
       </w:r>
       <w:r>
-        <w:t xml:space="preserve">(</w:t>
+        <w:t xml:space="preserve">→ навести на окружение → значок шестерёнки справа. Значок облака в заголовке уже открытой сессии только показывает окружение, изменить там нельзя. ✅</w:t>
+      </w:r>
+      <w:r>
+        <w:t xml:space="preserve"> </w:t>
+      </w:r>
+      <w:r>
+        <w:t xml:space="preserve">-</w:t>
+      </w:r>
+      <w:r>
+        <w:t xml:space="preserve"> </w:t>
+      </w:r>
+      <w:r>
+        <w:rPr>
+          <w:bCs/>
+          <w:b/>
+        </w:rPr>
+        <w:t xml:space="preserve">Network access</w:t>
+      </w:r>
+      <w:r>
+        <w:t xml:space="preserve"> </w:t>
+      </w:r>
+      <w:r>
+        <w:t xml:space="preserve">→</w:t>
+      </w:r>
+      <w:r>
+        <w:t xml:space="preserve"> </w:t>
       </w:r>
       <w:r>
         <w:rPr>
           <w:iCs/>
           <w:i/>
         </w:rPr>
-        <w:t xml:space="preserve">Cloud</w:t>
-      </w:r>
-      <w:r>
-        <w:t xml:space="preserve">) → навести на окружение → значок шестерёнки справа → окно редактирования окружения. Значок облака в заголовке уже открытой сессии только показывает окружение, изменить там нельзя (✅ проверено):</w:t>
-      </w:r>
-      <w:r>
-        <w:t xml:space="preserve"> </w:t>
-      </w:r>
-      <w:r>
-        <w:t xml:space="preserve">-</w:t>
+        <w:t xml:space="preserve">Custom</w:t>
+      </w:r>
+      <w:r>
+        <w:t xml:space="preserve"> </w:t>
+      </w:r>
+      <w:r>
+        <w:t xml:space="preserve">→ в поле</w:t>
       </w:r>
       <w:r>
         <w:t xml:space="preserve"> </w:t>
@@ -508,13 +582,25 @@
           <w:bCs/>
           <w:b/>
         </w:rPr>
-        <w:t xml:space="preserve">Network access</w:t>
-      </w:r>
-      <w:r>
-        <w:t xml:space="preserve"> </w:t>
-      </w:r>
-      <w:r>
-        <w:t xml:space="preserve">→</w:t>
+        <w:t xml:space="preserve">Allowed domains</w:t>
+      </w:r>
+      <w:r>
+        <w:t xml:space="preserve"> </w:t>
+      </w:r>
+      <w:r>
+        <w:t xml:space="preserve">написать</w:t>
+      </w:r>
+      <w:r>
+        <w:t xml:space="preserve"> </w:t>
+      </w:r>
+      <w:r>
+        <w:rPr>
+          <w:rStyle w:val="VerbatimChar"/>
+        </w:rPr>
+        <w:t xml:space="preserve">&lt;портал&gt;.bitrix24.ru</w:t>
+      </w:r>
+      <w:r>
+        <w:t xml:space="preserve">; отметить</w:t>
       </w:r>
       <w:r>
         <w:t xml:space="preserve"> </w:t>
@@ -524,13 +610,78 @@
           <w:iCs/>
           <w:i/>
         </w:rPr>
-        <w:t xml:space="preserve">Custom</w:t>
-      </w:r>
-      <w:r>
-        <w:t xml:space="preserve"> </w:t>
-      </w:r>
-      <w:r>
-        <w:t xml:space="preserve">→ в поле</w:t>
+        <w:t xml:space="preserve">Also include default list of common package managers</w:t>
+      </w:r>
+      <w:r>
+        <w:t xml:space="preserve"> </w:t>
+      </w:r>
+      <w:r>
+        <w:t xml:space="preserve">→ сохранить. Начинает действовать и в открытой сессии через 1–2 минуты. ✅</w:t>
+      </w:r>
+      <w:r>
+        <w:t xml:space="preserve"> </w:t>
+      </w:r>
+      <w:r>
+        <w:t xml:space="preserve">- Адрес вебхука не вставлять в чат, а сохранить в окружении: раздел</w:t>
+      </w:r>
+      <w:r>
+        <w:t xml:space="preserve"> </w:t>
+      </w:r>
+      <w:r>
+        <w:rPr>
+          <w:iCs/>
+          <w:i/>
+        </w:rPr>
+        <w:t xml:space="preserve">Network secrets</w:t>
+      </w:r>
+      <w:r>
+        <w:t xml:space="preserve"> </w:t>
+      </w:r>
+      <w:r>
+        <w:t xml:space="preserve">(тарифы Pro/Max) или поле</w:t>
+      </w:r>
+      <w:r>
+        <w:t xml:space="preserve"> </w:t>
+      </w:r>
+      <w:r>
+        <w:rPr>
+          <w:iCs/>
+          <w:i/>
+        </w:rPr>
+        <w:t xml:space="preserve">Environment variables</w:t>
+      </w:r>
+      <w:r>
+        <w:t xml:space="preserve"> </w:t>
+      </w:r>
+      <w:r>
+        <w:t xml:space="preserve">строкой</w:t>
+      </w:r>
+      <w:r>
+        <w:t xml:space="preserve"> </w:t>
+      </w:r>
+      <w:r>
+        <w:rPr>
+          <w:rStyle w:val="VerbatimChar"/>
+        </w:rPr>
+        <w:t xml:space="preserve">B24_WEBHOOK_URL=&lt;адрес вебхука&gt;</w:t>
+      </w:r>
+      <w:r>
+        <w:t xml:space="preserve"> </w:t>
+      </w:r>
+      <w:r>
+        <w:t xml:space="preserve">(адрес заканчивается на</w:t>
+      </w:r>
+      <w:r>
+        <w:t xml:space="preserve"> </w:t>
+      </w:r>
+      <w:r>
+        <w:rPr>
+          <w:rStyle w:val="VerbatimChar"/>
+        </w:rPr>
+        <w:t xml:space="preserve">/</w:t>
+      </w:r>
+      <w:r>
+        <w:t xml:space="preserve">). Переменная видна всем, кто пользуется окружением, поэтому окружение должно быть личным; сессия подхватывает её при</w:t>
       </w:r>
       <w:r>
         <w:t xml:space="preserve"> </w:t>
@@ -540,25 +691,19 @@
           <w:bCs/>
           <w:b/>
         </w:rPr>
-        <w:t xml:space="preserve">Allowed domains</w:t>
-      </w:r>
-      <w:r>
-        <w:t xml:space="preserve"> </w:t>
-      </w:r>
-      <w:r>
-        <w:t xml:space="preserve">написать</w:t>
-      </w:r>
-      <w:r>
-        <w:t xml:space="preserve"> </w:t>
-      </w:r>
-      <w:r>
-        <w:rPr>
-          <w:rStyle w:val="VerbatimChar"/>
-        </w:rPr>
-        <w:t xml:space="preserve">&lt;портал&gt;.bitrix24.ru</w:t>
-      </w:r>
-      <w:r>
-        <w:t xml:space="preserve">; отметить</w:t>
+        <w:t xml:space="preserve">новом</w:t>
+      </w:r>
+      <w:r>
+        <w:t xml:space="preserve"> </w:t>
+      </w:r>
+      <w:r>
+        <w:t xml:space="preserve">запуске. ⚠️</w:t>
+      </w:r>
+      <w:r>
+        <w:t xml:space="preserve"> </w:t>
+      </w:r>
+      <w:r>
+        <w:t xml:space="preserve">- Если окружение в разделе</w:t>
       </w:r>
       <w:r>
         <w:t xml:space="preserve"> </w:t>
@@ -568,116 +713,13 @@
           <w:iCs/>
           <w:i/>
         </w:rPr>
-        <w:t xml:space="preserve">Also include default list of common package managers</w:t>
-      </w:r>
-      <w:r>
-        <w:t xml:space="preserve"> </w:t>
-      </w:r>
-      <w:r>
-        <w:t xml:space="preserve">→ сохранить. Действует и в уже открытой сессии примерно через минуту.</w:t>
-      </w:r>
-      <w:r>
-        <w:t xml:space="preserve"> </w:t>
-      </w:r>
-      <w:r>
-        <w:t xml:space="preserve">- Адрес вебхука сохранить в разделе</w:t>
-      </w:r>
-      <w:r>
-        <w:t xml:space="preserve"> </w:t>
-      </w:r>
-      <w:r>
-        <w:rPr>
-          <w:iCs/>
-          <w:i/>
-        </w:rPr>
-        <w:t xml:space="preserve">Network secrets</w:t>
-      </w:r>
-      <w:r>
-        <w:t xml:space="preserve"> </w:t>
-      </w:r>
-      <w:r>
-        <w:t xml:space="preserve">(есть только на тарифах Pro/Max) или в поле</w:t>
-      </w:r>
-      <w:r>
-        <w:t xml:space="preserve"> </w:t>
-      </w:r>
-      <w:r>
-        <w:rPr>
-          <w:iCs/>
-          <w:i/>
-        </w:rPr>
-        <w:t xml:space="preserve">Environment variables</w:t>
-      </w:r>
-      <w:r>
-        <w:t xml:space="preserve"> </w:t>
-      </w:r>
-      <w:r>
-        <w:t xml:space="preserve">строкой</w:t>
-      </w:r>
-      <w:r>
-        <w:t xml:space="preserve"> </w:t>
-      </w:r>
-      <w:r>
-        <w:rPr>
-          <w:rStyle w:val="VerbatimChar"/>
-        </w:rPr>
-        <w:t xml:space="preserve">B24_WEBHOOK_URL=&lt;адрес вебхука&gt;</w:t>
-      </w:r>
-      <w:r>
-        <w:t xml:space="preserve"> </w:t>
-      </w:r>
-      <w:r>
-        <w:t xml:space="preserve">(адрес заканчивается на</w:t>
-      </w:r>
-      <w:r>
-        <w:t xml:space="preserve"> </w:t>
-      </w:r>
-      <w:r>
-        <w:rPr>
-          <w:rStyle w:val="VerbatimChar"/>
-        </w:rPr>
-        <w:t xml:space="preserve">/</w:t>
-      </w:r>
-      <w:r>
-        <w:t xml:space="preserve">). Переменная видна всем, кто пользуется окружением, поэтому окружение должно быть личным. Переменную сессия подхватывает при</w:t>
-      </w:r>
-      <w:r>
-        <w:t xml:space="preserve"> </w:t>
-      </w:r>
-      <w:r>
-        <w:rPr>
-          <w:bCs/>
-          <w:b/>
-        </w:rPr>
-        <w:t xml:space="preserve">новом</w:t>
-      </w:r>
-      <w:r>
-        <w:t xml:space="preserve"> </w:t>
-      </w:r>
-      <w:r>
-        <w:t xml:space="preserve">запуске.</w:t>
-      </w:r>
-      <w:r>
-        <w:t xml:space="preserve"> </w:t>
-      </w:r>
-      <w:r>
-        <w:t xml:space="preserve">- Если окружение в разделе</w:t>
-      </w:r>
-      <w:r>
-        <w:t xml:space="preserve"> </w:t>
-      </w:r>
-      <w:r>
-        <w:rPr>
-          <w:iCs/>
-          <w:i/>
-        </w:rPr>
         <w:t xml:space="preserve">Organization</w:t>
       </w:r>
       <w:r>
         <w:t xml:space="preserve"> </w:t>
       </w:r>
       <w:r>
-        <w:t xml:space="preserve">— оно общее и открывается только для чтения: менять его должен владелец, писать ГД.</w:t>
+        <w:t xml:space="preserve">— оно общее и только для чтения: менять его должен владелец, писать ГД. ⚠️</w:t>
       </w:r>
     </w:p>
     <w:bookmarkEnd w:id="21"/>
@@ -687,7 +729,7 @@
         <w:pStyle w:val="Heading2"/>
       </w:pPr>
       <w:r>
-        <w:t xml:space="preserve">3. Подключение и проверка</w:t>
+        <w:t xml:space="preserve">3. Подключение и проверка ✅</w:t>
       </w:r>
     </w:p>
     <w:p>
@@ -698,7 +740,7 @@
         </w:numPr>
       </w:pPr>
       <w:r>
-        <w:t xml:space="preserve">Открыть новую сессию Claude Code в настроенном окружении. ⚠️</w:t>
+        <w:t xml:space="preserve">Открыть сессию Claude Code в настроенном окружении.</w:t>
       </w:r>
     </w:p>
     <w:p>
@@ -709,7 +751,7 @@
         </w:numPr>
       </w:pPr>
       <w:r>
-        <w:t xml:space="preserve">Отправить проверочный запрос: ⚠️</w:t>
+        <w:t xml:space="preserve">Отправить проверочный запрос:</w:t>
       </w:r>
     </w:p>
     <w:p>
@@ -721,7 +763,7 @@
         <w:pStyle w:val="BlockText"/>
       </w:pPr>
       <w:r>
-        <w:t xml:space="preserve">Проверь подключение к Битрикс24 через вебхук из переменной</w:t>
+        <w:t xml:space="preserve">Проверь подключение к Битрикс24 через мой вебхук: вызови методы</w:t>
       </w:r>
       <w:r>
         <w:t xml:space="preserve"> </w:t>
@@ -730,10 +772,10 @@
         <w:rPr>
           <w:rStyle w:val="VerbatimChar"/>
         </w:rPr>
-        <w:t xml:space="preserve">B24_WEBHOOK_URL</w:t>
-      </w:r>
-      <w:r>
-        <w:t xml:space="preserve">: вызови методы</w:t>
+        <w:t xml:space="preserve">scope</w:t>
+      </w:r>
+      <w:r>
+        <w:t xml:space="preserve">,</w:t>
       </w:r>
       <w:r>
         <w:t xml:space="preserve"> </w:t>
@@ -742,7 +784,7 @@
         <w:rPr>
           <w:rStyle w:val="VerbatimChar"/>
         </w:rPr>
-        <w:t xml:space="preserve">scope</w:t>
+        <w:t xml:space="preserve">user.current</w:t>
       </w:r>
       <w:r>
         <w:t xml:space="preserve"> </w:t>
@@ -757,10 +799,25 @@
         <w:rPr>
           <w:rStyle w:val="VerbatimChar"/>
         </w:rPr>
-        <w:t xml:space="preserve">user.current</w:t>
-      </w:r>
-      <w:r>
-        <w:t xml:space="preserve">. Покажи только список прав и мой ID. Адрес вебхука не выводи. Ничего не изменяй.</w:t>
+        <w:t xml:space="preserve">tasks.task.get</w:t>
+      </w:r>
+      <w:r>
+        <w:t xml:space="preserve"> </w:t>
+      </w:r>
+      <w:r>
+        <w:t xml:space="preserve">для задачи</w:t>
+      </w:r>
+      <w:r>
+        <w:t xml:space="preserve"> </w:t>
+      </w:r>
+      <w:r>
+        <w:rPr>
+          <w:rStyle w:val="VerbatimChar"/>
+        </w:rPr>
+        <w:t xml:space="preserve">&lt;ID задачи&gt;</w:t>
+      </w:r>
+      <w:r>
+        <w:t xml:space="preserve">. Покажи список прав, мой ID, название и срок задачи. Адрес вебхука не выводи. Ничего не изменяй.</w:t>
       </w:r>
     </w:p>
     <w:p>
@@ -781,16 +838,16 @@
         <w:t xml:space="preserve"> </w:t>
       </w:r>
       <w:r>
-        <w:t xml:space="preserve">в ответе есть список прав (</w:t>
-      </w:r>
-      <w:r>
         <w:rPr>
           <w:rStyle w:val="VerbatimChar"/>
         </w:rPr>
-        <w:t xml:space="preserve">task</w:t>
-      </w:r>
-      <w:r>
-        <w:t xml:space="preserve">,</w:t>
+        <w:t xml:space="preserve">scope</w:t>
+      </w:r>
+      <w:r>
+        <w:t xml:space="preserve"> </w:t>
+      </w:r>
+      <w:r>
+        <w:t xml:space="preserve">возвращает</w:t>
       </w:r>
       <w:r>
         <w:t xml:space="preserve"> </w:t>
@@ -799,10 +856,25 @@
         <w:rPr>
           <w:rStyle w:val="VerbatimChar"/>
         </w:rPr>
-        <w:t xml:space="preserve">user</w:t>
-      </w:r>
-      <w:r>
-        <w:t xml:space="preserve">) и ваш ID пользователя, ошибок нет; затем Claude читает название и срок вашей задачи по запросу из п. 5.1.</w:t>
+        <w:t xml:space="preserve">task, user</w:t>
+      </w:r>
+      <w:r>
+        <w:t xml:space="preserve">;</w:t>
+      </w:r>
+      <w:r>
+        <w:t xml:space="preserve"> </w:t>
+      </w:r>
+      <w:r>
+        <w:rPr>
+          <w:rStyle w:val="VerbatimChar"/>
+        </w:rPr>
+        <w:t xml:space="preserve">user.current</w:t>
+      </w:r>
+      <w:r>
+        <w:t xml:space="preserve"> </w:t>
+      </w:r>
+      <w:r>
+        <w:t xml:space="preserve">— ваш ID; по своей задаче видны название, статус, срок и описание. Ошибок нет.</w:t>
       </w:r>
     </w:p>
     <w:bookmarkEnd w:id="22"/>
@@ -949,7 +1021,7 @@
               <w:rPr>
                 <w:sz w:val="18"/>
               </w:rPr>
-              <w:t xml:space="preserve">✅ наблюдали</w:t>
+              <w:t xml:space="preserve">✅</w:t>
             </w:r>
           </w:p>
         </w:tc>
@@ -982,37 +1054,37 @@
               <w:rPr>
                 <w:sz w:val="18"/>
               </w:rPr>
-              <w:t xml:space="preserve">домен портала не разрешён в сетевой политике окружения Claude Code</w:t>
-            </w:r>
-          </w:p>
-        </w:tc>
-        <w:tc>
-          <w:tcPr/>
-          <w:p>
-            <w:pPr>
-              <w:pStyle w:val="Compact"/>
-              <w:jc w:val="left"/>
-            </w:pPr>
-            <w:r>
-              <w:rPr>
-                <w:sz w:val="18"/>
-              </w:rPr>
-              <w:t xml:space="preserve">п. 2.2: добавить домен в Allowed domains, подождать минуту</w:t>
-            </w:r>
-          </w:p>
-        </w:tc>
-        <w:tc>
-          <w:tcPr/>
-          <w:p>
-            <w:pPr>
-              <w:pStyle w:val="Compact"/>
-              <w:jc w:val="left"/>
-            </w:pPr>
-            <w:r>
-              <w:rPr>
-                <w:sz w:val="18"/>
-              </w:rPr>
-              <w:t xml:space="preserve">✅ ошибка наблюдалась; ⚠️ решение не проверено</w:t>
+              <w:t xml:space="preserve">домен портала не разрешён в окружении Claude Code</w:t>
+            </w:r>
+          </w:p>
+        </w:tc>
+        <w:tc>
+          <w:tcPr/>
+          <w:p>
+            <w:pPr>
+              <w:pStyle w:val="Compact"/>
+              <w:jc w:val="left"/>
+            </w:pPr>
+            <w:r>
+              <w:rPr>
+                <w:sz w:val="18"/>
+              </w:rPr>
+              <w:t xml:space="preserve">п. 2.2: добавить домен в Allowed domains, подождать 1–2 минуты</w:t>
+            </w:r>
+          </w:p>
+        </w:tc>
+        <w:tc>
+          <w:tcPr/>
+          <w:p>
+            <w:pPr>
+              <w:pStyle w:val="Compact"/>
+              <w:jc w:val="left"/>
+            </w:pPr>
+            <w:r>
+              <w:rPr>
+                <w:sz w:val="18"/>
+              </w:rPr>
+              <w:t xml:space="preserve">✅</w:t>
             </w:r>
           </w:p>
         </w:tc>
@@ -1027,54 +1099,92 @@
             </w:pPr>
             <w:r>
               <w:rPr>
-                <w:sz w:val="18"/>
-              </w:rPr>
-              <w:t xml:space="preserve">Нет пункта «Входящий вебхук»</w:t>
-            </w:r>
-          </w:p>
-        </w:tc>
-        <w:tc>
-          <w:tcPr/>
-          <w:p>
-            <w:pPr>
-              <w:pStyle w:val="Compact"/>
-              <w:jc w:val="left"/>
-            </w:pPr>
-            <w:r>
-              <w:rPr>
-                <w:sz w:val="18"/>
-              </w:rPr>
-              <w:t xml:space="preserve">нет разрешения на создание вебхуков</w:t>
-            </w:r>
-          </w:p>
-        </w:tc>
-        <w:tc>
-          <w:tcPr/>
-          <w:p>
-            <w:pPr>
-              <w:pStyle w:val="Compact"/>
-              <w:jc w:val="left"/>
-            </w:pPr>
-            <w:r>
-              <w:rPr>
-                <w:sz w:val="18"/>
-              </w:rPr>
-              <w:t xml:space="preserve">написать ГД (см. табл. 1)</w:t>
-            </w:r>
-          </w:p>
-        </w:tc>
-        <w:tc>
-          <w:tcPr/>
-          <w:p>
-            <w:pPr>
-              <w:pStyle w:val="Compact"/>
-              <w:jc w:val="left"/>
-            </w:pPr>
-            <w:r>
-              <w:rPr>
-                <w:sz w:val="18"/>
-              </w:rPr>
-              <w:t xml:space="preserve">⚠️</w:t>
+                <w:rStyle w:val="VerbatimChar"/>
+                <w:sz w:val="18"/>
+              </w:rPr>
+              <w:t xml:space="preserve">insufficient_scope</w:t>
+            </w:r>
+            <w:r>
+              <w:rPr>
+                <w:sz w:val="18"/>
+              </w:rPr>
+              <w:t xml:space="preserve"> </w:t>
+            </w:r>
+            <w:r>
+              <w:rPr>
+                <w:sz w:val="18"/>
+              </w:rPr>
+              <w:t xml:space="preserve">на любой запрос,</w:t>
+            </w:r>
+            <w:r>
+              <w:rPr>
+                <w:sz w:val="18"/>
+              </w:rPr>
+              <w:t xml:space="preserve"> </w:t>
+            </w:r>
+            <w:r>
+              <w:rPr>
+                <w:rStyle w:val="VerbatimChar"/>
+                <w:sz w:val="18"/>
+              </w:rPr>
+              <w:t xml:space="preserve">scope</w:t>
+            </w:r>
+            <w:r>
+              <w:rPr>
+                <w:sz w:val="18"/>
+              </w:rPr>
+              <w:t xml:space="preserve"> </w:t>
+            </w:r>
+            <w:r>
+              <w:rPr>
+                <w:sz w:val="18"/>
+              </w:rPr>
+              <w:t xml:space="preserve">возвращает пустой список</w:t>
+            </w:r>
+          </w:p>
+        </w:tc>
+        <w:tc>
+          <w:tcPr/>
+          <w:p>
+            <w:pPr>
+              <w:pStyle w:val="Compact"/>
+              <w:jc w:val="left"/>
+            </w:pPr>
+            <w:r>
+              <w:rPr>
+                <w:sz w:val="18"/>
+              </w:rPr>
+              <w:t xml:space="preserve">вебхук не сохранён или у него не выбраны права</w:t>
+            </w:r>
+          </w:p>
+        </w:tc>
+        <w:tc>
+          <w:tcPr/>
+          <w:p>
+            <w:pPr>
+              <w:pStyle w:val="Compact"/>
+              <w:jc w:val="left"/>
+            </w:pPr>
+            <w:r>
+              <w:rPr>
+                <w:sz w:val="18"/>
+              </w:rPr>
+              <w:t xml:space="preserve">в форме вебхука выбрать «Задачи (task)» и «Пользователи (user)», нажать «Создать»/«Сохранить»</w:t>
+            </w:r>
+          </w:p>
+        </w:tc>
+        <w:tc>
+          <w:tcPr/>
+          <w:p>
+            <w:pPr>
+              <w:pStyle w:val="Compact"/>
+              <w:jc w:val="left"/>
+            </w:pPr>
+            <w:r>
+              <w:rPr>
+                <w:sz w:val="18"/>
+              </w:rPr>
+              <w:t xml:space="preserve">✅</w:t>
             </w:r>
           </w:p>
         </w:tc>
@@ -1089,9 +1199,46 @@
             </w:pPr>
             <w:r>
               <w:rPr>
+                <w:sz w:val="18"/>
+              </w:rPr>
+              <w:t xml:space="preserve">Комментарии не читаются:</w:t>
+            </w:r>
+            <w:r>
+              <w:rPr>
+                <w:sz w:val="18"/>
+              </w:rPr>
+              <w:t xml:space="preserve"> </w:t>
+            </w:r>
+            <w:r>
+              <w:rPr>
                 <w:rStyle w:val="VerbatimChar"/>
                 <w:sz w:val="18"/>
               </w:rPr>
+              <w:t xml:space="preserve">task.commentitem.getlist</w:t>
+            </w:r>
+            <w:r>
+              <w:rPr>
+                <w:sz w:val="18"/>
+              </w:rPr>
+              <w:t xml:space="preserve"> </w:t>
+            </w:r>
+            <w:r>
+              <w:rPr>
+                <w:sz w:val="18"/>
+              </w:rPr>
+              <w:t xml:space="preserve">возвращает 0, чтение чата —</w:t>
+            </w:r>
+            <w:r>
+              <w:rPr>
+                <w:sz w:val="18"/>
+              </w:rPr>
+              <w:t xml:space="preserve"> </w:t>
+            </w:r>
+            <w:r>
+              <w:rPr>
+                <w:rStyle w:val="VerbatimChar"/>
+                <w:sz w:val="18"/>
+              </w:rPr>
               <w:t xml:space="preserve">insufficient_scope</w:t>
             </w:r>
           </w:p>
@@ -1107,22 +1254,7 @@
               <w:rPr>
                 <w:sz w:val="18"/>
               </w:rPr>
-              <w:t xml:space="preserve">у вебхука нет нужного права</w:t>
-            </w:r>
-          </w:p>
-        </w:tc>
-        <w:tc>
-          <w:tcPr/>
-          <w:p>
-            <w:pPr>
-              <w:pStyle w:val="Compact"/>
-              <w:jc w:val="left"/>
-            </w:pPr>
-            <w:r>
-              <w:rPr>
-                <w:sz w:val="18"/>
-              </w:rPr>
-              <w:t xml:space="preserve">открыть свой вебхук, добавить право</w:t>
+              <w:t xml:space="preserve">обсуждение идёт в «Чате задачи», для него нужно право</w:t>
             </w:r>
             <w:r>
               <w:rPr>
@@ -1135,22 +1267,62 @@
                 <w:rStyle w:val="VerbatimChar"/>
                 <w:sz w:val="18"/>
               </w:rPr>
-              <w:t xml:space="preserve">task</w:t>
-            </w:r>
-          </w:p>
-        </w:tc>
-        <w:tc>
-          <w:tcPr/>
-          <w:p>
-            <w:pPr>
-              <w:pStyle w:val="Compact"/>
-              <w:jc w:val="left"/>
-            </w:pPr>
-            <w:r>
-              <w:rPr>
-                <w:sz w:val="18"/>
-              </w:rPr>
-              <w:t xml:space="preserve">⚠️</w:t>
+              <w:t xml:space="preserve">im</w:t>
+            </w:r>
+          </w:p>
+        </w:tc>
+        <w:tc>
+          <w:tcPr/>
+          <w:p>
+            <w:pPr>
+              <w:pStyle w:val="Compact"/>
+              <w:jc w:val="left"/>
+            </w:pPr>
+            <w:r>
+              <w:rPr>
+                <w:sz w:val="18"/>
+              </w:rPr>
+              <w:t xml:space="preserve">указать ограничение в отчёте; право</w:t>
+            </w:r>
+            <w:r>
+              <w:rPr>
+                <w:sz w:val="18"/>
+              </w:rPr>
+              <w:t xml:space="preserve"> </w:t>
+            </w:r>
+            <w:r>
+              <w:rPr>
+                <w:rStyle w:val="VerbatimChar"/>
+                <w:sz w:val="18"/>
+              </w:rPr>
+              <w:t xml:space="preserve">im</w:t>
+            </w:r>
+            <w:r>
+              <w:rPr>
+                <w:sz w:val="18"/>
+              </w:rPr>
+              <w:t xml:space="preserve"> </w:t>
+            </w:r>
+            <w:r>
+              <w:rPr>
+                <w:sz w:val="18"/>
+              </w:rPr>
+              <w:t xml:space="preserve">— только по согласованию с ГД</w:t>
+            </w:r>
+          </w:p>
+        </w:tc>
+        <w:tc>
+          <w:tcPr/>
+          <w:p>
+            <w:pPr>
+              <w:pStyle w:val="Compact"/>
+              <w:jc w:val="left"/>
+            </w:pPr>
+            <w:r>
+              <w:rPr>
+                <w:sz w:val="18"/>
+              </w:rPr>
+              <w:t xml:space="preserve">✅ ограничение подтверждено</w:t>
             </w:r>
           </w:p>
         </w:tc>
@@ -1165,52 +1337,39 @@
             </w:pPr>
             <w:r>
               <w:rPr>
-                <w:rStyle w:val="VerbatimChar"/>
-                <w:sz w:val="18"/>
-              </w:rPr>
-              <w:t xml:space="preserve">ACCESS_DENIED</w:t>
-            </w:r>
-            <w:r>
-              <w:rPr>
-                <w:sz w:val="18"/>
-              </w:rPr>
-              <w:t xml:space="preserve"> </w:t>
-            </w:r>
-            <w:r>
-              <w:rPr>
-                <w:sz w:val="18"/>
-              </w:rPr>
-              <w:t xml:space="preserve">или пустой ответ по задаче</w:t>
-            </w:r>
-          </w:p>
-        </w:tc>
-        <w:tc>
-          <w:tcPr/>
-          <w:p>
-            <w:pPr>
-              <w:pStyle w:val="Compact"/>
-              <w:jc w:val="left"/>
-            </w:pPr>
-            <w:r>
-              <w:rPr>
-                <w:sz w:val="18"/>
-              </w:rPr>
-              <w:t xml:space="preserve">вы не участник этой задачи</w:t>
-            </w:r>
-          </w:p>
-        </w:tc>
-        <w:tc>
-          <w:tcPr/>
-          <w:p>
-            <w:pPr>
-              <w:pStyle w:val="Compact"/>
-              <w:jc w:val="left"/>
-            </w:pPr>
-            <w:r>
-              <w:rPr>
-                <w:sz w:val="18"/>
-              </w:rPr>
-              <w:t xml:space="preserve">работать только со своими задачами</w:t>
+                <w:sz w:val="18"/>
+              </w:rPr>
+              <w:t xml:space="preserve">Нет пункта «Входящий вебхук»</w:t>
+            </w:r>
+          </w:p>
+        </w:tc>
+        <w:tc>
+          <w:tcPr/>
+          <w:p>
+            <w:pPr>
+              <w:pStyle w:val="Compact"/>
+              <w:jc w:val="left"/>
+            </w:pPr>
+            <w:r>
+              <w:rPr>
+                <w:sz w:val="18"/>
+              </w:rPr>
+              <w:t xml:space="preserve">нет разрешения на создание вебхуков</w:t>
+            </w:r>
+          </w:p>
+        </w:tc>
+        <w:tc>
+          <w:tcPr/>
+          <w:p>
+            <w:pPr>
+              <w:pStyle w:val="Compact"/>
+              <w:jc w:val="left"/>
+            </w:pPr>
+            <w:r>
+              <w:rPr>
+                <w:sz w:val="18"/>
+              </w:rPr>
+              <w:t xml:space="preserve">написать ГД (см. табл. 1)</w:t>
             </w:r>
           </w:p>
         </w:tc>
@@ -1243,7 +1402,7 @@
                 <w:rStyle w:val="VerbatimChar"/>
                 <w:sz w:val="18"/>
               </w:rPr>
-              <w:t xml:space="preserve">Invalid request credentials</w:t>
+              <w:t xml:space="preserve">ACCESS_DENIED</w:t>
             </w:r>
             <w:r>
               <w:rPr>
@@ -1255,50 +1414,37 @@
               <w:rPr>
                 <w:sz w:val="18"/>
               </w:rPr>
-              <w:t xml:space="preserve">/ 401</w:t>
-            </w:r>
-          </w:p>
-        </w:tc>
-        <w:tc>
-          <w:tcPr/>
-          <w:p>
-            <w:pPr>
-              <w:pStyle w:val="Compact"/>
-              <w:jc w:val="left"/>
-            </w:pPr>
-            <w:r>
-              <w:rPr>
-                <w:sz w:val="18"/>
-              </w:rPr>
-              <w:t xml:space="preserve">ключ неверный, вебхук удалён</w:t>
-            </w:r>
-          </w:p>
-        </w:tc>
-        <w:tc>
-          <w:tcPr/>
-          <w:p>
-            <w:pPr>
-              <w:pStyle w:val="Compact"/>
-              <w:jc w:val="left"/>
-            </w:pPr>
-            <w:r>
-              <w:rPr>
-                <w:sz w:val="18"/>
-              </w:rPr>
-              <w:t xml:space="preserve">создать новый вебхук, обновить</w:t>
-            </w:r>
-            <w:r>
-              <w:rPr>
-                <w:sz w:val="18"/>
-              </w:rPr>
-              <w:t xml:space="preserve"> </w:t>
-            </w:r>
-            <w:r>
-              <w:rPr>
-                <w:rStyle w:val="VerbatimChar"/>
-                <w:sz w:val="18"/>
-              </w:rPr>
-              <w:t xml:space="preserve">B24_WEBHOOK_URL</w:t>
+              <w:t xml:space="preserve">или пустой ответ по задаче</w:t>
+            </w:r>
+          </w:p>
+        </w:tc>
+        <w:tc>
+          <w:tcPr/>
+          <w:p>
+            <w:pPr>
+              <w:pStyle w:val="Compact"/>
+              <w:jc w:val="left"/>
+            </w:pPr>
+            <w:r>
+              <w:rPr>
+                <w:sz w:val="18"/>
+              </w:rPr>
+              <w:t xml:space="preserve">вы не участник этой задачи</w:t>
+            </w:r>
+          </w:p>
+        </w:tc>
+        <w:tc>
+          <w:tcPr/>
+          <w:p>
+            <w:pPr>
+              <w:pStyle w:val="Compact"/>
+              <w:jc w:val="left"/>
+            </w:pPr>
+            <w:r>
+              <w:rPr>
+                <w:sz w:val="18"/>
+              </w:rPr>
+              <w:t xml:space="preserve">работать только со своими задачами</w:t>
             </w:r>
           </w:p>
         </w:tc>
@@ -1328,24 +1474,10 @@
             </w:pPr>
             <w:r>
               <w:rPr>
-                <w:sz w:val="18"/>
-              </w:rPr>
-              <w:t xml:space="preserve">Claude не видит комментарии</w:t>
-            </w:r>
-          </w:p>
-        </w:tc>
-        <w:tc>
-          <w:tcPr/>
-          <w:p>
-            <w:pPr>
-              <w:pStyle w:val="Compact"/>
-              <w:jc w:val="left"/>
-            </w:pPr>
-            <w:r>
-              <w:rPr>
-                <w:sz w:val="18"/>
-              </w:rPr>
-              <w:t xml:space="preserve">в новой карточке задачи обсуждение идёт в «Чате задачи», метод</w:t>
+                <w:rStyle w:val="VerbatimChar"/>
+                <w:sz w:val="18"/>
+              </w:rPr>
+              <w:t xml:space="preserve">Invalid request credentials</w:t>
             </w:r>
             <w:r>
               <w:rPr>
@@ -1355,75 +1487,52 @@
             </w:r>
             <w:r>
               <w:rPr>
+                <w:sz w:val="18"/>
+              </w:rPr>
+              <w:t xml:space="preserve">/ 401</w:t>
+            </w:r>
+          </w:p>
+        </w:tc>
+        <w:tc>
+          <w:tcPr/>
+          <w:p>
+            <w:pPr>
+              <w:pStyle w:val="Compact"/>
+              <w:jc w:val="left"/>
+            </w:pPr>
+            <w:r>
+              <w:rPr>
+                <w:sz w:val="18"/>
+              </w:rPr>
+              <w:t xml:space="preserve">ключ неверный или перегенерирован</w:t>
+            </w:r>
+          </w:p>
+        </w:tc>
+        <w:tc>
+          <w:tcPr/>
+          <w:p>
+            <w:pPr>
+              <w:pStyle w:val="Compact"/>
+              <w:jc w:val="left"/>
+            </w:pPr>
+            <w:r>
+              <w:rPr>
+                <w:sz w:val="18"/>
+              </w:rPr>
+              <w:t xml:space="preserve">взять актуальный адрес в форме вебхука, обновить</w:t>
+            </w:r>
+            <w:r>
+              <w:rPr>
+                <w:sz w:val="18"/>
+              </w:rPr>
+              <w:t xml:space="preserve"> </w:t>
+            </w:r>
+            <w:r>
+              <w:rPr>
                 <w:rStyle w:val="VerbatimChar"/>
                 <w:sz w:val="18"/>
               </w:rPr>
-              <w:t xml:space="preserve">task.commentitem.getlist</w:t>
-            </w:r>
-            <w:r>
-              <w:rPr>
-                <w:sz w:val="18"/>
-              </w:rPr>
-              <w:t xml:space="preserve"> </w:t>
-            </w:r>
-            <w:r>
-              <w:rPr>
-                <w:sz w:val="18"/>
-              </w:rPr>
-              <w:t xml:space="preserve">его может не вернуть; для чата нужно право</w:t>
-            </w:r>
-            <w:r>
-              <w:rPr>
-                <w:sz w:val="18"/>
-              </w:rPr>
-              <w:t xml:space="preserve"> </w:t>
-            </w:r>
-            <w:r>
-              <w:rPr>
-                <w:rStyle w:val="VerbatimChar"/>
-                <w:sz w:val="18"/>
-              </w:rPr>
-              <w:t xml:space="preserve">im</w:t>
-            </w:r>
-          </w:p>
-        </w:tc>
-        <w:tc>
-          <w:tcPr/>
-          <w:p>
-            <w:pPr>
-              <w:pStyle w:val="Compact"/>
-              <w:jc w:val="left"/>
-            </w:pPr>
-            <w:r>
-              <w:rPr>
-                <w:sz w:val="18"/>
-              </w:rPr>
-              <w:t xml:space="preserve">указать ограничение в отчёте; право</w:t>
-            </w:r>
-            <w:r>
-              <w:rPr>
-                <w:sz w:val="18"/>
-              </w:rPr>
-              <w:t xml:space="preserve"> </w:t>
-            </w:r>
-            <w:r>
-              <w:rPr>
-                <w:rStyle w:val="VerbatimChar"/>
-                <w:sz w:val="18"/>
-              </w:rPr>
-              <w:t xml:space="preserve">im</w:t>
-            </w:r>
-            <w:r>
-              <w:rPr>
-                <w:sz w:val="18"/>
-              </w:rPr>
-              <w:t xml:space="preserve"> </w:t>
-            </w:r>
-            <w:r>
-              <w:rPr>
-                <w:sz w:val="18"/>
-              </w:rPr>
-              <w:t xml:space="preserve">добавлять только по согласованию с ГД</w:t>
+              <w:t xml:space="preserve">B24_WEBHOOK_URL</w:t>
             </w:r>
           </w:p>
         </w:tc>
@@ -1459,7 +1568,23 @@
         <w:t xml:space="preserve"> </w:t>
       </w:r>
       <w:r>
-        <w:t xml:space="preserve">удалить этот вебхук в Битрикс24, создать новый и обновить секрет в окружении.</w:t>
+        <w:t xml:space="preserve">в форме вебхука нажать</w:t>
+      </w:r>
+      <w:r>
+        <w:t xml:space="preserve"> </w:t>
+      </w:r>
+      <w:r>
+        <w:rPr>
+          <w:bCs/>
+          <w:b/>
+        </w:rPr>
+        <w:t xml:space="preserve">«Перегенерировать»</w:t>
+      </w:r>
+      <w:r>
+        <w:t xml:space="preserve"> </w:t>
+      </w:r>
+      <w:r>
+        <w:t xml:space="preserve">— старый адрес перестанет работать; новый сохранить в окружении.</w:t>
       </w:r>
     </w:p>
     <w:bookmarkEnd w:id="23"/>
@@ -1469,7 +1594,7 @@
         <w:pStyle w:val="Heading2"/>
       </w:pPr>
       <w:r>
-        <w:t xml:space="preserve">5. Примеры запросов (только чтение, на своей задаче)</w:t>
+        <w:t xml:space="preserve">5. Примеры запросов (только чтение, на своей задаче) ✅</w:t>
       </w:r>
     </w:p>
     <w:p>
@@ -1483,12 +1608,6 @@
         </w:rPr>
         <w:t xml:space="preserve">5.1. Понять постановку</w:t>
       </w:r>
-      <w:r>
-        <w:t xml:space="preserve"> </w:t>
-      </w:r>
-      <w:r>
-        <w:t xml:space="preserve">⚠️</w:t>
-      </w:r>
     </w:p>
     <w:p>
       <w:pPr>
@@ -1522,7 +1641,7 @@
         <w:t xml:space="preserve">tasks.task.get</w:t>
       </w:r>
       <w:r>
-        <w:t xml:space="preserve">) и комментарии к ней, если они доступны. Ничего не изменяй. Кратко изложи: цель, ожидаемый результат и критерии приёмки, срок, ограничения, что уже сделано по комментариям, и какие вопросы стоит задать постановщику. Если комментарии недоступны — так и напиши.</w:t>
+        <w:t xml:space="preserve">) и комментарии к ней, если они доступны. Ничего не изменяй. Кратко изложи: цель, ожидаемый результат и критерии приёмки, срок, ограничения, что уже сделано, и какие вопросы стоит задать постановщику. Если комментарии недоступны — так и напиши.</w:t>
       </w:r>
     </w:p>
     <w:p>
@@ -1536,12 +1655,6 @@
         </w:rPr>
         <w:t xml:space="preserve">5.2. Составить план выполнения</w:t>
       </w:r>
-      <w:r>
-        <w:t xml:space="preserve"> </w:t>
-      </w:r>
-      <w:r>
-        <w:t xml:space="preserve">⚠️</w:t>
-      </w:r>
     </w:p>
     <w:p>
       <w:pPr>
@@ -1577,12 +1690,6 @@
         </w:rPr>
         <w:t xml:space="preserve">5.3. Подготовить отчёт о результате</w:t>
       </w:r>
-      <w:r>
-        <w:t xml:space="preserve"> </w:t>
-      </w:r>
-      <w:r>
-        <w:t xml:space="preserve">⚠️</w:t>
-      </w:r>
     </w:p>
     <w:p>
       <w:pPr>
@@ -1605,6 +1712,14 @@
       </w:r>
       <w:r>
         <w:t xml:space="preserve">в формате: сделано / проверено самостоятельно / не проверено / нужно решение (не больше трёх вопросов, к каждому — мой вариант решения). Не публикуй — покажи текст мне.</w:t>
+      </w:r>
+    </w:p>
+    <w:p>
+      <w:pPr>
+        <w:pStyle w:val="FirstParagraph"/>
+      </w:pPr>
+      <w:r>
+        <w:t xml:space="preserve">Комментарии из «Чата задачи» Claude через этот вебхук не видит — важные договорённости из чата вставляйте в запрос сами (без секретов).</w:t>
       </w:r>
     </w:p>
     <w:bookmarkEnd w:id="24"/>

</xml_diff>

<commit_message>
Match environment menu labels in Bitrix24 memo
Co-Authored-By: Claude Opus 5.5 <noreply@anthropic.com>
Claude-Session: https://claude.ai/code/session_01QDqzUmjJPcgJuc8oYqmQ3L
</commit_message>
<xml_diff>
--- a/bitrix24-claude/pamyatka-claude-bitrix24.docx
+++ b/bitrix24-claude/pamyatka-claude-bitrix24.docx
@@ -528,13 +528,55 @@
           <w:bCs/>
           <w:b/>
         </w:rPr>
-        <w:t xml:space="preserve">Облако</w:t>
-      </w:r>
-      <w:r>
-        <w:t xml:space="preserve"> </w:t>
-      </w:r>
-      <w:r>
-        <w:t xml:space="preserve">→ навести на окружение → значок шестерёнки справа. Значок облака в заголовке уже открытой сессии только показывает окружение, изменить там нельзя. ✅</w:t>
+        <w:t xml:space="preserve">Cloud</w:t>
+      </w:r>
+      <w:r>
+        <w:t xml:space="preserve"> </w:t>
+      </w:r>
+      <w:r>
+        <w:t xml:space="preserve">→ навести на окружение → значок шестерёнки справа. Удобнее завести отдельное личное окружение для Битрикса:</w:t>
+      </w:r>
+      <w:r>
+        <w:t xml:space="preserve"> </w:t>
+      </w:r>
+      <w:r>
+        <w:rPr>
+          <w:bCs/>
+          <w:b/>
+        </w:rPr>
+        <w:t xml:space="preserve">Cloud</w:t>
+      </w:r>
+      <w:r>
+        <w:t xml:space="preserve"> </w:t>
+      </w:r>
+      <w:r>
+        <w:t xml:space="preserve">→</w:t>
+      </w:r>
+      <w:r>
+        <w:t xml:space="preserve"> </w:t>
+      </w:r>
+      <w:r>
+        <w:rPr>
+          <w:bCs/>
+          <w:b/>
+        </w:rPr>
+        <w:t xml:space="preserve">Add cloud environment…</w:t>
+      </w:r>
+      <w:r>
+        <w:t xml:space="preserve">, имя, например,</w:t>
+      </w:r>
+      <w:r>
+        <w:t xml:space="preserve"> </w:t>
+      </w:r>
+      <w:r>
+        <w:rPr>
+          <w:iCs/>
+          <w:i/>
+        </w:rPr>
+        <w:t xml:space="preserve">Bitrix</w:t>
+      </w:r>
+      <w:r>
+        <w:t xml:space="preserve">. Значок облака в заголовке уже открытой сессии только показывает окружение, изменить там нельзя. ✅</w:t>
       </w:r>
       <w:r>
         <w:t xml:space="preserve"> </w:t>

</xml_diff>